<commit_message>
Update presentation, report and code for submission
- Add team names and roll numbers to the presentation and report cover
- Update GitHub link to mini-project-1
- Simplify presentation style
- Clean up comments in script and notebook

Co-Authored-By: Claude Opus 5.5 <noreply@anthropic.com>
</commit_message>
<xml_diff>
--- a/deliverables/Loan_Approval_Project_Report.docx
+++ b/deliverables/Loan_Approval_Project_Report.docx
@@ -2,8 +2,6 @@
 <file path=word/document.xml><?xml version="1.0" encoding="utf-8"?>
 <w:document xmlns:wpc="http://schemas.microsoft.com/office/word/2010/wordprocessingCanvas" xmlns:mo="http://schemas.microsoft.com/office/mac/office/2008/main" xmlns:mc="http://schemas.openxmlformats.org/markup-compatibility/2006" xmlns:mv="urn:schemas-microsoft-com:mac:vml" xmlns:o="urn:schemas-microsoft-com:office:office" xmlns:r="http://schemas.openxmlformats.org/officeDocument/2006/relationships" xmlns:m="http://schemas.openxmlformats.org/officeDocument/2006/math" xmlns:v="urn:schemas-microsoft-com:vml" xmlns:wp14="http://schemas.microsoft.com/office/word/2010/wordprocessingDrawing" xmlns:wp="http://schemas.openxmlformats.org/drawingml/2006/wordprocessingDrawing" xmlns:w10="urn:schemas-microsoft-com:office:word" xmlns:w="http://schemas.openxmlformats.org/wordprocessingml/2006/main" xmlns:w14="http://schemas.microsoft.com/office/word/2010/wordml" xmlns:wpg="http://schemas.microsoft.com/office/word/2010/wordprocessingGroup" xmlns:wpi="http://schemas.microsoft.com/office/word/2010/wordprocessingInk" xmlns:wne="http://schemas.microsoft.com/office/word/2006/wordml" xmlns:wps="http://schemas.microsoft.com/office/word/2010/wordprocessingShape" mc:Ignorable="w14 wp14">
   <w:body>
-    <w:p/>
-    <w:p/>
     <w:p/>
     <w:p/>
     <w:p/>
@@ -54,11 +52,252 @@
       </w:pPr>
       <w:r>
         <w:rPr>
+          <w:b/>
           <w:i w:val="0"/>
-          <w:sz w:val="24"/>
+          <w:color w:val="0F2C4C"/>
+          <w:sz w:val="26"/>
         </w:rPr>
-        <w:t>Group members: ________________________________</w:t>
+        <w:t>Submitted by</w:t>
       </w:r>
+    </w:p>
+    <w:tbl>
+      <w:tblPr>
+        <w:tblStyle w:val="TableGrid"/>
+        <w:tblW w:type="auto" w:w="0"/>
+        <w:jc w:val="center"/>
+        <w:tblLook w:firstColumn="1" w:firstRow="1" w:lastColumn="0" w:lastRow="0" w:noHBand="0" w:noVBand="1" w:val="04A0"/>
+      </w:tblPr>
+      <w:tblGrid>
+        <w:gridCol w:w="4873"/>
+        <w:gridCol w:w="4873"/>
+      </w:tblGrid>
+      <w:tr>
+        <w:tc>
+          <w:tcPr>
+            <w:tcW w:type="dxa" w:w="3744"/>
+            <w:shd w:val="clear" w:color="auto" w:fill="0F2C4C"/>
+          </w:tcPr>
+          <w:p>
+            <w:pPr>
+              <w:spacing w:after="0"/>
+            </w:pPr>
+            <w:r/>
+            <w:r>
+              <w:rPr>
+                <w:b/>
+                <w:color w:val="FFFFFF"/>
+                <w:sz w:val="21"/>
+              </w:rPr>
+              <w:t>Name</w:t>
+            </w:r>
+          </w:p>
+        </w:tc>
+        <w:tc>
+          <w:tcPr>
+            <w:tcW w:type="dxa" w:w="2304"/>
+            <w:shd w:val="clear" w:color="auto" w:fill="0F2C4C"/>
+          </w:tcPr>
+          <w:p>
+            <w:pPr>
+              <w:spacing w:after="0"/>
+            </w:pPr>
+            <w:r/>
+            <w:r>
+              <w:rPr>
+                <w:b/>
+                <w:color w:val="FFFFFF"/>
+                <w:sz w:val="21"/>
+              </w:rPr>
+              <w:t>Roll No.</w:t>
+            </w:r>
+          </w:p>
+        </w:tc>
+      </w:tr>
+      <w:tr>
+        <w:tc>
+          <w:tcPr>
+            <w:tcW w:type="dxa" w:w="3744"/>
+          </w:tcPr>
+          <w:p>
+            <w:pPr>
+              <w:spacing w:after="0"/>
+            </w:pPr>
+            <w:r/>
+            <w:r>
+              <w:rPr>
+                <w:sz w:val="21"/>
+              </w:rPr>
+              <w:t>Agamjot Singh Dhingra</w:t>
+            </w:r>
+          </w:p>
+        </w:tc>
+        <w:tc>
+          <w:tcPr>
+            <w:tcW w:type="dxa" w:w="2304"/>
+          </w:tcPr>
+          <w:p>
+            <w:pPr>
+              <w:spacing w:after="0"/>
+            </w:pPr>
+            <w:r/>
+            <w:r>
+              <w:rPr>
+                <w:sz w:val="21"/>
+              </w:rPr>
+              <w:t>1025150317</w:t>
+            </w:r>
+          </w:p>
+        </w:tc>
+      </w:tr>
+      <w:tr>
+        <w:tc>
+          <w:tcPr>
+            <w:tcW w:type="dxa" w:w="3744"/>
+          </w:tcPr>
+          <w:p>
+            <w:pPr>
+              <w:spacing w:after="0"/>
+            </w:pPr>
+            <w:r/>
+            <w:r>
+              <w:rPr>
+                <w:sz w:val="21"/>
+              </w:rPr>
+              <w:t>Nikunj Singla</w:t>
+            </w:r>
+          </w:p>
+        </w:tc>
+        <w:tc>
+          <w:tcPr>
+            <w:tcW w:type="dxa" w:w="2304"/>
+          </w:tcPr>
+          <w:p>
+            <w:pPr>
+              <w:spacing w:after="0"/>
+            </w:pPr>
+            <w:r/>
+            <w:r>
+              <w:rPr>
+                <w:sz w:val="21"/>
+              </w:rPr>
+              <w:t>1025150306</w:t>
+            </w:r>
+          </w:p>
+        </w:tc>
+      </w:tr>
+      <w:tr>
+        <w:tc>
+          <w:tcPr>
+            <w:tcW w:type="dxa" w:w="3744"/>
+          </w:tcPr>
+          <w:p>
+            <w:pPr>
+              <w:spacing w:after="0"/>
+            </w:pPr>
+            <w:r/>
+            <w:r>
+              <w:rPr>
+                <w:sz w:val="21"/>
+              </w:rPr>
+              <w:t>Panshul Sharma</w:t>
+            </w:r>
+          </w:p>
+        </w:tc>
+        <w:tc>
+          <w:tcPr>
+            <w:tcW w:type="dxa" w:w="2304"/>
+          </w:tcPr>
+          <w:p>
+            <w:pPr>
+              <w:spacing w:after="0"/>
+            </w:pPr>
+            <w:r/>
+            <w:r>
+              <w:rPr>
+                <w:sz w:val="21"/>
+              </w:rPr>
+              <w:t>1025150302</w:t>
+            </w:r>
+          </w:p>
+        </w:tc>
+      </w:tr>
+      <w:tr>
+        <w:tc>
+          <w:tcPr>
+            <w:tcW w:type="dxa" w:w="3744"/>
+          </w:tcPr>
+          <w:p>
+            <w:pPr>
+              <w:spacing w:after="0"/>
+            </w:pPr>
+            <w:r/>
+            <w:r>
+              <w:rPr>
+                <w:sz w:val="21"/>
+              </w:rPr>
+              <w:t>Atharv Arora</w:t>
+            </w:r>
+          </w:p>
+        </w:tc>
+        <w:tc>
+          <w:tcPr>
+            <w:tcW w:type="dxa" w:w="2304"/>
+          </w:tcPr>
+          <w:p>
+            <w:pPr>
+              <w:spacing w:after="0"/>
+            </w:pPr>
+            <w:r/>
+            <w:r>
+              <w:rPr>
+                <w:sz w:val="21"/>
+              </w:rPr>
+              <w:t>1025150336</w:t>
+            </w:r>
+          </w:p>
+        </w:tc>
+      </w:tr>
+      <w:tr>
+        <w:tc>
+          <w:tcPr>
+            <w:tcW w:type="dxa" w:w="3744"/>
+          </w:tcPr>
+          <w:p>
+            <w:pPr>
+              <w:spacing w:after="0"/>
+            </w:pPr>
+            <w:r/>
+            <w:r>
+              <w:rPr>
+                <w:sz w:val="21"/>
+              </w:rPr>
+              <w:t>Aayush Goyal</w:t>
+            </w:r>
+          </w:p>
+        </w:tc>
+        <w:tc>
+          <w:tcPr>
+            <w:tcW w:type="dxa" w:w="2304"/>
+          </w:tcPr>
+          <w:p>
+            <w:pPr>
+              <w:spacing w:after="0"/>
+            </w:pPr>
+            <w:r/>
+            <w:r>
+              <w:rPr>
+                <w:sz w:val="21"/>
+              </w:rPr>
+              <w:t>1025150337</w:t>
+            </w:r>
+          </w:p>
+        </w:tc>
+      </w:tr>
+    </w:tbl>
+    <w:p>
+      <w:pPr>
+        <w:spacing w:after="40"/>
+      </w:pPr>
     </w:p>
     <w:p>
       <w:pPr>
@@ -88,7 +327,7 @@
           <w:i w:val="0"/>
           <w:sz w:val="24"/>
         </w:rPr>
-        <w:t>https://github.com/agamjotdhingra/MINIPROJECT1</w:t>
+        <w:t>https://github.com/agamjotdhingra/mini-project-1.git</w:t>
       </w:r>
     </w:p>
     <w:p>
@@ -4412,7 +4651,7 @@
         <w:rPr>
           <w:i w:val="0"/>
         </w:rPr>
-        <w:t>https://github.com/agamjotdhingra/MINIPROJECT1</w:t>
+        <w:t>https://github.com/agamjotdhingra/mini-project-1.git</w:t>
       </w:r>
     </w:p>
     <w:tbl>

</xml_diff>